<commit_message>
The reports are updating with the learnings. Also uploading a pdf so that it can be read in github easily.
</commit_message>
<xml_diff>
--- a/reports/SVM Model Report/Principle of Data Science Report.docx
+++ b/reports/SVM Model Report/Principle of Data Science Report.docx
@@ -435,12 +435,12 @@
           <wp:inline distB="114300" distT="114300" distL="114300" distR="114300">
             <wp:extent cx="3729038" cy="4483320"/>
             <wp:effectExtent b="0" l="0" r="0" t="0"/>
-            <wp:docPr id="4" name="image6.png"/>
+            <wp:docPr id="4" name="image1.png"/>
             <a:graphic>
               <a:graphicData uri="http://schemas.openxmlformats.org/drawingml/2006/picture">
                 <pic:pic>
                   <pic:nvPicPr>
-                    <pic:cNvPr id="0" name="image6.png"/>
+                    <pic:cNvPr id="0" name="image1.png"/>
                     <pic:cNvPicPr preferRelativeResize="0"/>
                   </pic:nvPicPr>
                   <pic:blipFill>
@@ -1647,12 +1647,12 @@
           <wp:inline distB="114300" distT="114300" distL="114300" distR="114300">
             <wp:extent cx="5943600" cy="2070100"/>
             <wp:effectExtent b="0" l="0" r="0" t="0"/>
-            <wp:docPr id="2" name="image1.png"/>
+            <wp:docPr id="2" name="image2.png"/>
             <a:graphic>
               <a:graphicData uri="http://schemas.openxmlformats.org/drawingml/2006/picture">
                 <pic:pic>
                   <pic:nvPicPr>
-                    <pic:cNvPr id="0" name="image1.png"/>
+                    <pic:cNvPr id="0" name="image2.png"/>
                     <pic:cNvPicPr preferRelativeResize="0"/>
                   </pic:nvPicPr>
                   <pic:blipFill>
@@ -1839,12 +1839,12 @@
           <wp:inline distB="114300" distT="114300" distL="114300" distR="114300">
             <wp:extent cx="2424113" cy="2169349"/>
             <wp:effectExtent b="0" l="0" r="0" t="0"/>
-            <wp:docPr id="7" name="image2.png"/>
+            <wp:docPr id="7" name="image3.png"/>
             <a:graphic>
               <a:graphicData uri="http://schemas.openxmlformats.org/drawingml/2006/picture">
                 <pic:pic>
                   <pic:nvPicPr>
-                    <pic:cNvPr id="0" name="image2.png"/>
+                    <pic:cNvPr id="0" name="image3.png"/>
                     <pic:cNvPicPr preferRelativeResize="0"/>
                   </pic:nvPicPr>
                   <pic:blipFill>
@@ -1887,12 +1887,12 @@
           <wp:inline distB="114300" distT="114300" distL="114300" distR="114300">
             <wp:extent cx="2486170" cy="2202730"/>
             <wp:effectExtent b="0" l="0" r="0" t="0"/>
-            <wp:docPr id="5" name="image3.png"/>
+            <wp:docPr id="5" name="image5.png"/>
             <a:graphic>
               <a:graphicData uri="http://schemas.openxmlformats.org/drawingml/2006/picture">
                 <pic:pic>
                   <pic:nvPicPr>
-                    <pic:cNvPr id="0" name="image3.png"/>
+                    <pic:cNvPr id="0" name="image5.png"/>
                     <pic:cNvPicPr preferRelativeResize="0"/>
                   </pic:nvPicPr>
                   <pic:blipFill>
@@ -1989,12 +1989,12 @@
           <wp:inline distB="114300" distT="114300" distL="114300" distR="114300">
             <wp:extent cx="2862263" cy="2258007"/>
             <wp:effectExtent b="0" l="0" r="0" t="0"/>
-            <wp:docPr id="1" name="image5.png"/>
+            <wp:docPr id="1" name="image6.png"/>
             <a:graphic>
               <a:graphicData uri="http://schemas.openxmlformats.org/drawingml/2006/picture">
                 <pic:pic>
                   <pic:nvPicPr>
-                    <pic:cNvPr id="0" name="image5.png"/>
+                    <pic:cNvPr id="0" name="image6.png"/>
                     <pic:cNvPicPr preferRelativeResize="0"/>
                   </pic:nvPicPr>
                   <pic:blipFill>
@@ -2324,7 +2324,7 @@
           <w:ilvl w:val="0"/>
           <w:numId w:val="1"/>
         </w:numPr>
-        <w:spacing w:after="240" w:before="0" w:beforeAutospacing="0" w:lineRule="auto"/>
+        <w:spacing w:after="0" w:afterAutospacing="0" w:before="0" w:beforeAutospacing="0" w:lineRule="auto"/>
         <w:ind w:left="720" w:hanging="360"/>
         <w:rPr>
           <w:rFonts w:ascii="Roboto" w:cs="Roboto" w:eastAsia="Roboto" w:hAnsi="Roboto"/>
@@ -2341,6 +2341,242 @@
           <w:rtl w:val="0"/>
         </w:rPr>
         <w:t xml:space="preserve">Features can be created from the audio samples, and SVM can also be used to determine the category of the emotion. We don’t need to train heavy time series models such as LSTM. </w:t>
+      </w:r>
+    </w:p>
+    <w:p>
+      <w:pPr>
+        <w:numPr>
+          <w:ilvl w:val="0"/>
+          <w:numId w:val="1"/>
+        </w:numPr>
+        <w:spacing w:after="0" w:afterAutospacing="0" w:before="0" w:beforeAutospacing="0" w:lineRule="auto"/>
+        <w:ind w:left="720" w:hanging="360"/>
+        <w:rPr>
+          <w:rFonts w:ascii="Roboto" w:cs="Roboto" w:eastAsia="Roboto" w:hAnsi="Roboto"/>
+          <w:sz w:val="21"/>
+          <w:szCs w:val="21"/>
+          <w:u w:val="none"/>
+        </w:rPr>
+      </w:pPr>
+      <w:r>
+        <w:rPr>
+          <w:rFonts w:ascii="Roboto" w:cs="Roboto" w:eastAsia="Roboto" w:hAnsi="Roboto"/>
+          <w:sz w:val="21"/>
+          <w:szCs w:val="21"/>
+          <w:rtl w:val="0"/>
+        </w:rPr>
+        <w:t xml:space="preserve">Allowing grid search to reduce the regularisation or to use the bigger model is a bad idea. It will always tend to overfit the training data and choose the bigger model with more complexity. </w:t>
+      </w:r>
+    </w:p>
+    <w:p>
+      <w:pPr>
+        <w:numPr>
+          <w:ilvl w:val="0"/>
+          <w:numId w:val="1"/>
+        </w:numPr>
+        <w:spacing w:after="0" w:afterAutospacing="0" w:before="0" w:beforeAutospacing="0" w:lineRule="auto"/>
+        <w:ind w:left="720" w:hanging="360"/>
+        <w:rPr>
+          <w:rFonts w:ascii="Roboto" w:cs="Roboto" w:eastAsia="Roboto" w:hAnsi="Roboto"/>
+          <w:sz w:val="21"/>
+          <w:szCs w:val="21"/>
+          <w:u w:val="none"/>
+        </w:rPr>
+      </w:pPr>
+      <w:r>
+        <w:rPr>
+          <w:rFonts w:ascii="Roboto" w:cs="Roboto" w:eastAsia="Roboto" w:hAnsi="Roboto"/>
+          <w:sz w:val="21"/>
+          <w:szCs w:val="21"/>
+          <w:rtl w:val="0"/>
+        </w:rPr>
+        <w:t xml:space="preserve">To perform real-time emotion detection, we have to sacrifice the performance of the model and choose smaller window sizes. Parallelising the feature generation helps a lot for streamlit applications. </w:t>
+      </w:r>
+    </w:p>
+    <w:p>
+      <w:pPr>
+        <w:keepNext w:val="0"/>
+        <w:keepLines w:val="0"/>
+        <w:pageBreakBefore w:val="0"/>
+        <w:widowControl w:val="1"/>
+        <w:numPr>
+          <w:ilvl w:val="0"/>
+          <w:numId w:val="1"/>
+        </w:numPr>
+        <w:pBdr>
+          <w:top w:space="0" w:sz="0" w:val="nil"/>
+          <w:left w:space="0" w:sz="0" w:val="nil"/>
+          <w:bottom w:space="0" w:sz="0" w:val="nil"/>
+          <w:right w:space="0" w:sz="0" w:val="nil"/>
+          <w:between w:space="0" w:sz="0" w:val="nil"/>
+        </w:pBdr>
+        <w:shd w:fill="auto" w:val="clear"/>
+        <w:spacing w:after="0" w:afterAutospacing="0" w:before="0" w:beforeAutospacing="0" w:line="276" w:lineRule="auto"/>
+        <w:ind w:left="720" w:right="0" w:hanging="360"/>
+        <w:jc w:val="left"/>
+        <w:rPr>
+          <w:rFonts w:ascii="Roboto" w:cs="Roboto" w:eastAsia="Roboto" w:hAnsi="Roboto"/>
+          <w:sz w:val="21"/>
+          <w:szCs w:val="21"/>
+        </w:rPr>
+      </w:pPr>
+      <w:r>
+        <w:rPr>
+          <w:rFonts w:ascii="Roboto" w:cs="Roboto" w:eastAsia="Roboto" w:hAnsi="Roboto"/>
+          <w:sz w:val="21"/>
+          <w:szCs w:val="21"/>
+          <w:rtl w:val="0"/>
+        </w:rPr>
+        <w:t xml:space="preserve">PCA preserves the strongest variance patterns in the data, while LDA preserves the directions that best separate the classes. So PCA is good for feature reduction while LDA sometimes is good for feature visualisation for better separability. </w:t>
+      </w:r>
+    </w:p>
+    <w:p>
+      <w:pPr>
+        <w:keepNext w:val="0"/>
+        <w:keepLines w:val="0"/>
+        <w:pageBreakBefore w:val="0"/>
+        <w:widowControl w:val="1"/>
+        <w:numPr>
+          <w:ilvl w:val="0"/>
+          <w:numId w:val="1"/>
+        </w:numPr>
+        <w:pBdr>
+          <w:top w:space="0" w:sz="0" w:val="nil"/>
+          <w:left w:space="0" w:sz="0" w:val="nil"/>
+          <w:bottom w:space="0" w:sz="0" w:val="nil"/>
+          <w:right w:space="0" w:sz="0" w:val="nil"/>
+          <w:between w:space="0" w:sz="0" w:val="nil"/>
+        </w:pBdr>
+        <w:shd w:fill="auto" w:val="clear"/>
+        <w:spacing w:after="0" w:afterAutospacing="0" w:before="0" w:beforeAutospacing="0" w:line="276" w:lineRule="auto"/>
+        <w:ind w:left="720" w:right="0" w:hanging="360"/>
+        <w:jc w:val="left"/>
+        <w:rPr>
+          <w:rFonts w:ascii="Roboto" w:cs="Roboto" w:eastAsia="Roboto" w:hAnsi="Roboto"/>
+          <w:sz w:val="21"/>
+          <w:szCs w:val="21"/>
+        </w:rPr>
+      </w:pPr>
+      <w:r>
+        <w:rPr>
+          <w:rFonts w:ascii="Roboto" w:cs="Roboto" w:eastAsia="Roboto" w:hAnsi="Roboto"/>
+          <w:sz w:val="21"/>
+          <w:szCs w:val="21"/>
+          <w:rtl w:val="0"/>
+        </w:rPr>
+        <w:t xml:space="preserve">To remove the gender bias, we can do the Kfold cross validation. In this way the reported model accuracy is correct. </w:t>
+      </w:r>
+    </w:p>
+    <w:p>
+      <w:pPr>
+        <w:keepNext w:val="0"/>
+        <w:keepLines w:val="0"/>
+        <w:pageBreakBefore w:val="0"/>
+        <w:widowControl w:val="1"/>
+        <w:numPr>
+          <w:ilvl w:val="0"/>
+          <w:numId w:val="1"/>
+        </w:numPr>
+        <w:pBdr>
+          <w:top w:space="0" w:sz="0" w:val="nil"/>
+          <w:left w:space="0" w:sz="0" w:val="nil"/>
+          <w:bottom w:space="0" w:sz="0" w:val="nil"/>
+          <w:right w:space="0" w:sz="0" w:val="nil"/>
+          <w:between w:space="0" w:sz="0" w:val="nil"/>
+        </w:pBdr>
+        <w:shd w:fill="auto" w:val="clear"/>
+        <w:spacing w:after="0" w:afterAutospacing="0" w:before="0" w:beforeAutospacing="0" w:line="276" w:lineRule="auto"/>
+        <w:ind w:left="720" w:right="0" w:hanging="360"/>
+        <w:jc w:val="left"/>
+        <w:rPr>
+          <w:rFonts w:ascii="Roboto" w:cs="Roboto" w:eastAsia="Roboto" w:hAnsi="Roboto"/>
+          <w:sz w:val="21"/>
+          <w:szCs w:val="21"/>
+        </w:rPr>
+      </w:pPr>
+      <w:r>
+        <w:rPr>
+          <w:rFonts w:ascii="Roboto" w:cs="Roboto" w:eastAsia="Roboto" w:hAnsi="Roboto"/>
+          <w:sz w:val="21"/>
+          <w:szCs w:val="21"/>
+          <w:rtl w:val="0"/>
+        </w:rPr>
+        <w:t xml:space="preserve">Files organization in folder is very important. This way we would know where the scripts, notebooks, data files are. </w:t>
+      </w:r>
+    </w:p>
+    <w:p>
+      <w:pPr>
+        <w:keepNext w:val="0"/>
+        <w:keepLines w:val="0"/>
+        <w:pageBreakBefore w:val="0"/>
+        <w:widowControl w:val="1"/>
+        <w:numPr>
+          <w:ilvl w:val="0"/>
+          <w:numId w:val="1"/>
+        </w:numPr>
+        <w:pBdr>
+          <w:top w:space="0" w:sz="0" w:val="nil"/>
+          <w:left w:space="0" w:sz="0" w:val="nil"/>
+          <w:bottom w:space="0" w:sz="0" w:val="nil"/>
+          <w:right w:space="0" w:sz="0" w:val="nil"/>
+          <w:between w:space="0" w:sz="0" w:val="nil"/>
+        </w:pBdr>
+        <w:shd w:fill="auto" w:val="clear"/>
+        <w:spacing w:after="0" w:afterAutospacing="0" w:before="0" w:beforeAutospacing="0" w:line="276" w:lineRule="auto"/>
+        <w:ind w:left="720" w:right="0" w:hanging="360"/>
+        <w:jc w:val="left"/>
+        <w:rPr>
+          <w:rFonts w:ascii="Roboto" w:cs="Roboto" w:eastAsia="Roboto" w:hAnsi="Roboto"/>
+          <w:sz w:val="21"/>
+          <w:szCs w:val="21"/>
+          <w:u w:val="none"/>
+        </w:rPr>
+      </w:pPr>
+      <w:r>
+        <w:rPr>
+          <w:rFonts w:ascii="Roboto" w:cs="Roboto" w:eastAsia="Roboto" w:hAnsi="Roboto"/>
+          <w:sz w:val="21"/>
+          <w:szCs w:val="21"/>
+          <w:rtl w:val="0"/>
+        </w:rPr>
+        <w:t xml:space="preserve">Learnt about gamma hyperparameter in SVM. Also the c parameter that is used for regularization. </w:t>
+      </w:r>
+    </w:p>
+    <w:p>
+      <w:pPr>
+        <w:keepNext w:val="0"/>
+        <w:keepLines w:val="0"/>
+        <w:pageBreakBefore w:val="0"/>
+        <w:widowControl w:val="1"/>
+        <w:numPr>
+          <w:ilvl w:val="0"/>
+          <w:numId w:val="1"/>
+        </w:numPr>
+        <w:pBdr>
+          <w:top w:space="0" w:sz="0" w:val="nil"/>
+          <w:left w:space="0" w:sz="0" w:val="nil"/>
+          <w:bottom w:space="0" w:sz="0" w:val="nil"/>
+          <w:right w:space="0" w:sz="0" w:val="nil"/>
+          <w:between w:space="0" w:sz="0" w:val="nil"/>
+        </w:pBdr>
+        <w:shd w:fill="auto" w:val="clear"/>
+        <w:spacing w:after="240" w:before="0" w:beforeAutospacing="0" w:line="276" w:lineRule="auto"/>
+        <w:ind w:left="720" w:right="0" w:hanging="360"/>
+        <w:jc w:val="left"/>
+        <w:rPr>
+          <w:rFonts w:ascii="Roboto" w:cs="Roboto" w:eastAsia="Roboto" w:hAnsi="Roboto"/>
+          <w:sz w:val="21"/>
+          <w:szCs w:val="21"/>
+        </w:rPr>
+      </w:pPr>
+      <w:r>
+        <w:rPr>
+          <w:rFonts w:ascii="Roboto" w:cs="Roboto" w:eastAsia="Roboto" w:hAnsi="Roboto"/>
+          <w:sz w:val="21"/>
+          <w:szCs w:val="21"/>
+          <w:rtl w:val="0"/>
+        </w:rPr>
+        <w:t xml:space="preserve">Learnt about worktrees in github as tools like codex are becoming popular. </w:t>
       </w:r>
       <w:r>
         <w:rPr>

</xml_diff>